<commit_message>
revisions exam3 et highlitgts
</commit_message>
<xml_diff>
--- a/énoncés/Annexe12_SQLite.docx
+++ b/énoncés/Annexe12_SQLite.docx
@@ -583,8 +583,36 @@
           <w:sz w:val="26"/>
           <w:szCs w:val="26"/>
         </w:rPr>
-        <w:t>** index :  INTEGER PRIMARY KEY AUTOINCREMENT ( doit s'appeler _id )</w:t>
-      </w:r>
+        <w:t xml:space="preserve">** index :  INTEGER PRIMARY KEY AUTOINCREMENT </w:t>
+      </w:r>
+      <w:proofErr w:type="gramStart"/>
+      <w:r>
+        <w:rPr>
+          <w:rFonts w:ascii="Tw Cen MT" w:hAnsi="Tw Cen MT"/>
+          <w:sz w:val="26"/>
+          <w:szCs w:val="26"/>
+        </w:rPr>
+        <w:t>( doit</w:t>
+      </w:r>
+      <w:proofErr w:type="gramEnd"/>
+      <w:r>
+        <w:rPr>
+          <w:rFonts w:ascii="Tw Cen MT" w:hAnsi="Tw Cen MT"/>
+          <w:sz w:val="26"/>
+          <w:szCs w:val="26"/>
+        </w:rPr>
+        <w:t xml:space="preserve"> s'appeler _</w:t>
+      </w:r>
+      <w:proofErr w:type="gramStart"/>
+      <w:r>
+        <w:rPr>
+          <w:rFonts w:ascii="Tw Cen MT" w:hAnsi="Tw Cen MT"/>
+          <w:sz w:val="26"/>
+          <w:szCs w:val="26"/>
+        </w:rPr>
+        <w:t>id )</w:t>
+      </w:r>
+      <w:proofErr w:type="gramEnd"/>
     </w:p>
     <w:p>
       <w:pPr>
@@ -790,18 +818,8 @@
                 <w:sz w:val="26"/>
                 <w:szCs w:val="26"/>
               </w:rPr>
-              <w:t xml:space="preserve">Laszlo </w:t>
-            </w:r>
-            <w:proofErr w:type="spellStart"/>
-            <w:r>
-              <w:rPr>
-                <w:rFonts w:ascii="Tw Cen MT" w:hAnsi="Tw Cen MT"/>
-                <w:sz w:val="26"/>
-                <w:szCs w:val="26"/>
-              </w:rPr>
-              <w:t>Biro</w:t>
-            </w:r>
-            <w:proofErr w:type="spellEnd"/>
+              <w:t>Laszlo Biro</w:t>
+            </w:r>
           </w:p>
         </w:tc>
         <w:tc>
@@ -1160,18 +1178,8 @@
                 <w:sz w:val="26"/>
                 <w:szCs w:val="26"/>
               </w:rPr>
-              <w:t xml:space="preserve">Benoit </w:t>
-            </w:r>
-            <w:proofErr w:type="spellStart"/>
-            <w:r>
-              <w:rPr>
-                <w:rFonts w:ascii="Tw Cen MT" w:hAnsi="Tw Cen MT"/>
-                <w:sz w:val="26"/>
-                <w:szCs w:val="26"/>
-              </w:rPr>
-              <w:t>Rouquayrot</w:t>
-            </w:r>
-            <w:proofErr w:type="spellEnd"/>
+              <w:t>Benoit Rouquayrot</w:t>
+            </w:r>
           </w:p>
         </w:tc>
         <w:tc>
@@ -1351,11 +1359,16 @@
         <w:t xml:space="preserve"> (permet de créer nos tables</w:t>
       </w:r>
       <w:r>
-        <w:t xml:space="preserve"> et les opérations sur elles </w:t>
+        <w:t xml:space="preserve"> et les opérations sur </w:t>
+      </w:r>
+      <w:proofErr w:type="gramStart"/>
+      <w:r>
+        <w:t xml:space="preserve">elles </w:t>
       </w:r>
       <w:r>
         <w:t>)</w:t>
       </w:r>
+      <w:proofErr w:type="gramEnd"/>
     </w:p>
     <w:p>
       <w:pPr>
@@ -1452,7 +1465,25 @@
           <w:b/>
           <w:sz w:val="28"/>
         </w:rPr>
-        <w:t xml:space="preserve"> ( singleton )</w:t>
+        <w:t xml:space="preserve"> </w:t>
+      </w:r>
+      <w:proofErr w:type="gramStart"/>
+      <w:r>
+        <w:rPr>
+          <w:rFonts w:ascii="Courier New" w:hAnsi="Courier New" w:cs="Courier New"/>
+          <w:b/>
+          <w:sz w:val="28"/>
+        </w:rPr>
+        <w:t>( singleton</w:t>
+      </w:r>
+      <w:proofErr w:type="gramEnd"/>
+      <w:r>
+        <w:rPr>
+          <w:rFonts w:ascii="Courier New" w:hAnsi="Courier New" w:cs="Courier New"/>
+          <w:b/>
+          <w:sz w:val="28"/>
+        </w:rPr>
+        <w:t xml:space="preserve"> )</w:t>
       </w:r>
     </w:p>
     <w:p>
@@ -1488,7 +1519,7 @@
     </w:p>
     <w:p>
       <w:pPr>
-        <w:pStyle w:val="Paragraphedeliste"/>
+        <w:pStyle w:val="ListParagraph"/>
         <w:numPr>
           <w:ilvl w:val="0"/>
           <w:numId w:val="25"/>
@@ -1604,7 +1635,16 @@
           <w:sz w:val="26"/>
           <w:szCs w:val="26"/>
         </w:rPr>
-        <w:t xml:space="preserve"> ( </w:t>
+        <w:t> </w:t>
+      </w:r>
+      <w:proofErr w:type="gramStart"/>
+      <w:r>
+        <w:rPr>
+          <w:rFonts w:ascii="Courier New" w:hAnsi="Courier New" w:cs="Courier New"/>
+          <w:sz w:val="26"/>
+          <w:szCs w:val="26"/>
+        </w:rPr>
+        <w:t xml:space="preserve">( </w:t>
       </w:r>
       <w:proofErr w:type="spellStart"/>
       <w:r>
@@ -1616,6 +1656,7 @@
         <w:t>SQLiteDatabase</w:t>
       </w:r>
       <w:proofErr w:type="spellEnd"/>
+      <w:proofErr w:type="gramEnd"/>
       <w:r>
         <w:rPr>
           <w:rFonts w:ascii="Courier New" w:hAnsi="Courier New" w:cs="Courier New"/>
@@ -1625,6 +1666,7 @@
         <w:t xml:space="preserve"> </w:t>
       </w:r>
       <w:proofErr w:type="spellStart"/>
+      <w:proofErr w:type="gramStart"/>
       <w:r>
         <w:rPr>
           <w:rFonts w:ascii="Courier New" w:hAnsi="Courier New" w:cs="Courier New"/>
@@ -1642,6 +1684,7 @@
         </w:rPr>
         <w:t xml:space="preserve"> )</w:t>
       </w:r>
+      <w:proofErr w:type="gramEnd"/>
     </w:p>
     <w:p>
       <w:pPr>
@@ -1658,7 +1701,7 @@
     </w:p>
     <w:p>
       <w:pPr>
-        <w:pStyle w:val="Paragraphedeliste"/>
+        <w:pStyle w:val="ListParagraph"/>
         <w:numPr>
           <w:ilvl w:val="0"/>
           <w:numId w:val="18"/>
@@ -1680,7 +1723,7 @@
     </w:p>
     <w:p>
       <w:pPr>
-        <w:pStyle w:val="Paragraphedeliste"/>
+        <w:pStyle w:val="ListParagraph"/>
         <w:numPr>
           <w:ilvl w:val="0"/>
           <w:numId w:val="23"/>
@@ -1689,6 +1732,7 @@
           <w:rFonts w:ascii="Lato" w:hAnsi="Lato" w:cs="Courier New"/>
           <w:sz w:val="26"/>
           <w:szCs w:val="26"/>
+          <w:highlight w:val="yellow"/>
         </w:rPr>
       </w:pPr>
       <w:r>
@@ -1698,7 +1742,16 @@
           <w:szCs w:val="26"/>
         </w:rPr>
         <w:lastRenderedPageBreak/>
-        <w:t>IMPORTANT : cette méthode n’est appelée qu’une fois, lors de l’installation de l’app</w:t>
+        <w:t xml:space="preserve">IMPORTANT : </w:t>
+      </w:r>
+      <w:r>
+        <w:rPr>
+          <w:rFonts w:ascii="Lato" w:hAnsi="Lato" w:cs="Courier New"/>
+          <w:sz w:val="26"/>
+          <w:szCs w:val="26"/>
+          <w:highlight w:val="yellow"/>
+        </w:rPr>
+        <w:t>cette méthode n’est appelée qu’une fois, lors de l’installation de l’app</w:t>
       </w:r>
     </w:p>
     <w:p>
@@ -1740,7 +1793,16 @@
           <w:sz w:val="26"/>
           <w:szCs w:val="26"/>
         </w:rPr>
-        <w:t xml:space="preserve"> ( </w:t>
+        <w:t xml:space="preserve"> </w:t>
+      </w:r>
+      <w:proofErr w:type="gramStart"/>
+      <w:r>
+        <w:rPr>
+          <w:rFonts w:ascii="Courier New" w:hAnsi="Courier New" w:cs="Courier New"/>
+          <w:sz w:val="26"/>
+          <w:szCs w:val="26"/>
+        </w:rPr>
+        <w:t xml:space="preserve">( </w:t>
       </w:r>
       <w:proofErr w:type="spellStart"/>
       <w:r>
@@ -1752,6 +1814,7 @@
         <w:t>SQLiteDatabase</w:t>
       </w:r>
       <w:proofErr w:type="spellEnd"/>
+      <w:proofErr w:type="gramEnd"/>
       <w:r>
         <w:rPr>
           <w:rFonts w:ascii="Courier New" w:hAnsi="Courier New" w:cs="Courier New"/>
@@ -1833,6 +1896,7 @@
         <w:t xml:space="preserve"> </w:t>
       </w:r>
       <w:proofErr w:type="spellStart"/>
+      <w:proofErr w:type="gramStart"/>
       <w:r>
         <w:rPr>
           <w:rFonts w:ascii="Courier New" w:hAnsi="Courier New" w:cs="Courier New"/>
@@ -1850,6 +1914,7 @@
         </w:rPr>
         <w:t xml:space="preserve"> )</w:t>
       </w:r>
+      <w:proofErr w:type="gramEnd"/>
     </w:p>
     <w:p>
       <w:pPr>
@@ -1882,7 +1947,6 @@
         </w:placeholder>
         <w:showingPlcHdr/>
       </w:sdtPr>
-      <w:sdtEndPr/>
       <w:sdtContent>
         <w:p>
           <w:pPr>
@@ -1897,7 +1961,7 @@
           </w:pPr>
           <w:r>
             <w:rPr>
-              <w:rStyle w:val="Textedelespacerserv"/>
+              <w:rStyle w:val="PlaceholderText"/>
             </w:rPr>
             <w:t>Cliquez ou appuyez ici pour entrer du texte.</w:t>
           </w:r>
@@ -2032,6 +2096,7 @@
               </w:rPr>
             </w:pPr>
             <w:proofErr w:type="spellStart"/>
+            <w:proofErr w:type="gramStart"/>
             <w:r>
               <w:rPr>
                 <w:rFonts w:ascii="Courier New" w:hAnsi="Courier New" w:cs="Courier New"/>
@@ -2041,6 +2106,7 @@
               <w:t>execSQL</w:t>
             </w:r>
             <w:proofErr w:type="spellEnd"/>
+            <w:proofErr w:type="gramEnd"/>
           </w:p>
         </w:tc>
         <w:tc>
@@ -2072,6 +2138,7 @@
                 <w:szCs w:val="26"/>
               </w:rPr>
             </w:pPr>
+            <w:proofErr w:type="gramStart"/>
             <w:r>
               <w:rPr>
                 <w:rFonts w:ascii="Tw Cen MT" w:hAnsi="Tw Cen MT"/>
@@ -2090,14 +2157,25 @@
               <w:t>create</w:t>
             </w:r>
             <w:proofErr w:type="spellEnd"/>
-            <w:r>
-              <w:rPr>
-                <w:rFonts w:ascii="Tw Cen MT" w:hAnsi="Tw Cen MT"/>
-                <w:sz w:val="26"/>
-                <w:szCs w:val="26"/>
-              </w:rPr>
-              <w:t xml:space="preserve"> table )</w:t>
-            </w:r>
+            <w:proofErr w:type="gramEnd"/>
+            <w:r>
+              <w:rPr>
+                <w:rFonts w:ascii="Tw Cen MT" w:hAnsi="Tw Cen MT"/>
+                <w:sz w:val="26"/>
+                <w:szCs w:val="26"/>
+              </w:rPr>
+              <w:t xml:space="preserve"> </w:t>
+            </w:r>
+            <w:proofErr w:type="gramStart"/>
+            <w:r>
+              <w:rPr>
+                <w:rFonts w:ascii="Tw Cen MT" w:hAnsi="Tw Cen MT"/>
+                <w:sz w:val="26"/>
+                <w:szCs w:val="26"/>
+              </w:rPr>
+              <w:t>table )</w:t>
+            </w:r>
+            <w:proofErr w:type="gramEnd"/>
           </w:p>
           <w:p>
             <w:pPr>
@@ -2155,6 +2233,7 @@
                 <w:szCs w:val="26"/>
               </w:rPr>
             </w:pPr>
+            <w:proofErr w:type="gramStart"/>
             <w:r>
               <w:rPr>
                 <w:rFonts w:ascii="Courier New" w:hAnsi="Courier New" w:cs="Courier New"/>
@@ -2163,6 +2242,7 @@
               </w:rPr>
               <w:t>insert</w:t>
             </w:r>
+            <w:proofErr w:type="gramEnd"/>
           </w:p>
         </w:tc>
         <w:tc>
@@ -2348,7 +2428,6 @@
             </w:placeholder>
             <w:showingPlcHdr/>
           </w:sdtPr>
-          <w:sdtEndPr/>
           <w:sdtContent>
             <w:tc>
               <w:tcPr>
@@ -2364,7 +2443,7 @@
                 </w:pPr>
                 <w:r>
                   <w:rPr>
-                    <w:rStyle w:val="Textedelespacerserv"/>
+                    <w:rStyle w:val="PlaceholderText"/>
                   </w:rPr>
                   <w:t>Cliquez ou appuyez ici pour entrer du texte.</w:t>
                 </w:r>
@@ -2475,9 +2554,19 @@
       <w:r>
         <w:t xml:space="preserve">Ouvrir une instance de la base de données </w:t>
       </w:r>
-      <w:r>
-        <w:t>( l’appeler dans le constructeur )</w:t>
-      </w:r>
+      <w:proofErr w:type="gramStart"/>
+      <w:r>
+        <w:t>( l’appeler</w:t>
+      </w:r>
+      <w:proofErr w:type="gramEnd"/>
+      <w:r>
+        <w:t xml:space="preserve"> dans le </w:t>
+      </w:r>
+      <w:proofErr w:type="gramStart"/>
+      <w:r>
+        <w:t>constructeur )</w:t>
+      </w:r>
+      <w:proofErr w:type="gramEnd"/>
     </w:p>
     <w:p>
       <w:pPr>
@@ -2673,6 +2762,7 @@
                 <w:szCs w:val="26"/>
               </w:rPr>
             </w:pPr>
+            <w:proofErr w:type="gramStart"/>
             <w:r>
               <w:rPr>
                 <w:rFonts w:ascii="Tw Cen MT" w:hAnsi="Tw Cen MT"/>
@@ -2681,6 +2771,7 @@
               </w:rPr>
               <w:t>insert</w:t>
             </w:r>
+            <w:proofErr w:type="gramEnd"/>
           </w:p>
         </w:tc>
         <w:tc>
@@ -2704,6 +2795,7 @@
               <w:t xml:space="preserve">Insert (les données à insérer doivent être englobées dans un objet </w:t>
             </w:r>
             <w:proofErr w:type="spellStart"/>
+            <w:proofErr w:type="gramStart"/>
             <w:r>
               <w:rPr>
                 <w:rFonts w:ascii="Courier New" w:hAnsi="Courier New" w:cs="Courier New"/>
@@ -2721,6 +2813,7 @@
               </w:rPr>
               <w:t xml:space="preserve"> )</w:t>
             </w:r>
+            <w:proofErr w:type="gramEnd"/>
           </w:p>
         </w:tc>
         <w:tc>
@@ -2760,6 +2853,7 @@
               </w:rPr>
             </w:pPr>
             <w:proofErr w:type="spellStart"/>
+            <w:proofErr w:type="gramStart"/>
             <w:r>
               <w:rPr>
                 <w:rFonts w:ascii="Tw Cen MT" w:hAnsi="Tw Cen MT"/>
@@ -2769,6 +2863,7 @@
               <w:t>delete</w:t>
             </w:r>
             <w:proofErr w:type="spellEnd"/>
+            <w:proofErr w:type="gramEnd"/>
           </w:p>
         </w:tc>
         <w:tc>
@@ -2784,6 +2879,7 @@
               </w:rPr>
             </w:pPr>
             <w:proofErr w:type="spellStart"/>
+            <w:proofErr w:type="gramStart"/>
             <w:r>
               <w:rPr>
                 <w:rFonts w:ascii="Tw Cen MT" w:hAnsi="Tw Cen MT"/>
@@ -2793,6 +2889,7 @@
               <w:t>delete</w:t>
             </w:r>
             <w:proofErr w:type="spellEnd"/>
+            <w:proofErr w:type="gramEnd"/>
           </w:p>
         </w:tc>
         <w:tc>
@@ -2823,6 +2920,7 @@
                 <w:szCs w:val="26"/>
               </w:rPr>
             </w:pPr>
+            <w:proofErr w:type="gramStart"/>
             <w:r>
               <w:rPr>
                 <w:rFonts w:ascii="Tw Cen MT" w:hAnsi="Tw Cen MT"/>
@@ -2831,6 +2929,7 @@
               </w:rPr>
               <w:t>update</w:t>
             </w:r>
+            <w:proofErr w:type="gramEnd"/>
           </w:p>
         </w:tc>
         <w:tc>
@@ -2845,6 +2944,7 @@
                 <w:szCs w:val="26"/>
               </w:rPr>
             </w:pPr>
+            <w:proofErr w:type="gramStart"/>
             <w:r>
               <w:rPr>
                 <w:rFonts w:ascii="Tw Cen MT" w:hAnsi="Tw Cen MT"/>
@@ -2853,6 +2953,7 @@
               </w:rPr>
               <w:t>update</w:t>
             </w:r>
+            <w:proofErr w:type="gramEnd"/>
           </w:p>
         </w:tc>
         <w:tc>
@@ -2906,6 +3007,7 @@
               </w:rPr>
             </w:pPr>
             <w:proofErr w:type="spellStart"/>
+            <w:proofErr w:type="gramStart"/>
             <w:r>
               <w:rPr>
                 <w:rFonts w:ascii="Courier New" w:hAnsi="Courier New" w:cs="Courier New"/>
@@ -2915,6 +3017,7 @@
               <w:t>rawQuery</w:t>
             </w:r>
             <w:proofErr w:type="spellEnd"/>
+            <w:proofErr w:type="gramEnd"/>
             <w:r>
               <w:rPr>
                 <w:rFonts w:ascii="Tw Cen MT" w:hAnsi="Tw Cen MT"/>
@@ -2942,13 +3045,23 @@
                 <w:szCs w:val="26"/>
               </w:rPr>
             </w:pPr>
-            <w:r>
-              <w:rPr>
-                <w:rFonts w:ascii="Tw Cen MT" w:hAnsi="Tw Cen MT"/>
-                <w:sz w:val="26"/>
-                <w:szCs w:val="26"/>
-              </w:rPr>
-              <w:t xml:space="preserve">retourne un </w:t>
+            <w:proofErr w:type="gramStart"/>
+            <w:r>
+              <w:rPr>
+                <w:rFonts w:ascii="Tw Cen MT" w:hAnsi="Tw Cen MT"/>
+                <w:sz w:val="26"/>
+                <w:szCs w:val="26"/>
+              </w:rPr>
+              <w:t>retourne</w:t>
+            </w:r>
+            <w:proofErr w:type="gramEnd"/>
+            <w:r>
+              <w:rPr>
+                <w:rFonts w:ascii="Tw Cen MT" w:hAnsi="Tw Cen MT"/>
+                <w:sz w:val="26"/>
+                <w:szCs w:val="26"/>
+              </w:rPr>
+              <w:t xml:space="preserve"> un </w:t>
             </w:r>
             <w:proofErr w:type="spellStart"/>
             <w:r>
@@ -2975,6 +3088,7 @@
               </w:rPr>
             </w:pPr>
             <w:proofErr w:type="spellStart"/>
+            <w:proofErr w:type="gramStart"/>
             <w:r>
               <w:rPr>
                 <w:rFonts w:ascii="Courier New" w:hAnsi="Courier New" w:cs="Courier New"/>
@@ -2984,6 +3098,7 @@
               <w:t>createStatement</w:t>
             </w:r>
             <w:proofErr w:type="spellEnd"/>
+            <w:proofErr w:type="gramEnd"/>
             <w:r>
               <w:rPr>
                 <w:rFonts w:ascii="Tw Cen MT" w:hAnsi="Tw Cen MT"/>
@@ -3011,13 +3126,23 @@
                 <w:szCs w:val="26"/>
               </w:rPr>
             </w:pPr>
-            <w:r>
-              <w:rPr>
-                <w:rFonts w:ascii="Tw Cen MT" w:hAnsi="Tw Cen MT"/>
-                <w:sz w:val="26"/>
-                <w:szCs w:val="26"/>
-              </w:rPr>
-              <w:t xml:space="preserve">retourne un </w:t>
+            <w:proofErr w:type="gramStart"/>
+            <w:r>
+              <w:rPr>
+                <w:rFonts w:ascii="Tw Cen MT" w:hAnsi="Tw Cen MT"/>
+                <w:sz w:val="26"/>
+                <w:szCs w:val="26"/>
+              </w:rPr>
+              <w:t>retourne</w:t>
+            </w:r>
+            <w:proofErr w:type="gramEnd"/>
+            <w:r>
+              <w:rPr>
+                <w:rFonts w:ascii="Tw Cen MT" w:hAnsi="Tw Cen MT"/>
+                <w:sz w:val="26"/>
+                <w:szCs w:val="26"/>
+              </w:rPr>
+              <w:t xml:space="preserve"> un </w:t>
             </w:r>
             <w:proofErr w:type="spellStart"/>
             <w:r>
@@ -3051,7 +3176,16 @@
                 <w:sz w:val="26"/>
                 <w:szCs w:val="26"/>
               </w:rPr>
-              <w:t>Autres commandes qui ne retournent pas de résultats (</w:t>
+              <w:t xml:space="preserve">Autres commandes qui ne retournent pas de résultats </w:t>
+            </w:r>
+            <w:proofErr w:type="gramStart"/>
+            <w:r>
+              <w:rPr>
+                <w:rFonts w:ascii="Tw Cen MT" w:hAnsi="Tw Cen MT"/>
+                <w:sz w:val="26"/>
+                <w:szCs w:val="26"/>
+              </w:rPr>
+              <w:t>(</w:t>
             </w:r>
             <w:r>
               <w:t xml:space="preserve"> </w:t>
@@ -3066,13 +3200,32 @@
               <w:t>create</w:t>
             </w:r>
             <w:proofErr w:type="spellEnd"/>
-            <w:r>
-              <w:rPr>
-                <w:rFonts w:ascii="Tw Cen MT" w:hAnsi="Tw Cen MT"/>
-                <w:sz w:val="26"/>
-                <w:szCs w:val="26"/>
-              </w:rPr>
-              <w:t xml:space="preserve"> table, etc. ) </w:t>
+            <w:proofErr w:type="gramEnd"/>
+            <w:r>
+              <w:rPr>
+                <w:rFonts w:ascii="Tw Cen MT" w:hAnsi="Tw Cen MT"/>
+                <w:sz w:val="26"/>
+                <w:szCs w:val="26"/>
+              </w:rPr>
+              <w:t xml:space="preserve"> table, </w:t>
+            </w:r>
+            <w:proofErr w:type="gramStart"/>
+            <w:r>
+              <w:rPr>
+                <w:rFonts w:ascii="Tw Cen MT" w:hAnsi="Tw Cen MT"/>
+                <w:sz w:val="26"/>
+                <w:szCs w:val="26"/>
+              </w:rPr>
+              <w:t>etc. )</w:t>
+            </w:r>
+            <w:proofErr w:type="gramEnd"/>
+            <w:r>
+              <w:rPr>
+                <w:rFonts w:ascii="Tw Cen MT" w:hAnsi="Tw Cen MT"/>
+                <w:sz w:val="26"/>
+                <w:szCs w:val="26"/>
+              </w:rPr>
+              <w:t xml:space="preserve"> </w:t>
             </w:r>
           </w:p>
         </w:tc>
@@ -3089,6 +3242,7 @@
               </w:rPr>
             </w:pPr>
             <w:proofErr w:type="spellStart"/>
+            <w:proofErr w:type="gramStart"/>
             <w:r>
               <w:rPr>
                 <w:rFonts w:ascii="Courier New" w:hAnsi="Courier New" w:cs="Courier New"/>
@@ -3098,6 +3252,7 @@
               <w:t>execSQL</w:t>
             </w:r>
             <w:proofErr w:type="spellEnd"/>
+            <w:proofErr w:type="gramEnd"/>
           </w:p>
         </w:tc>
         <w:tc>
@@ -3251,9 +3406,28 @@
                 <w:sz w:val="26"/>
                 <w:szCs w:val="26"/>
               </w:rPr>
-              <w:t xml:space="preserve">Équivalent JDBC         ( </w:t>
+              <w:t xml:space="preserve">Équivalent JDBC      </w:t>
+            </w:r>
+            <w:proofErr w:type="gramStart"/>
+            <w:r>
+              <w:rPr>
+                <w:rFonts w:ascii="Tw Cen MT" w:hAnsi="Tw Cen MT"/>
+                <w:sz w:val="26"/>
+                <w:szCs w:val="26"/>
+              </w:rPr>
+              <w:t xml:space="preserve">   (</w:t>
+            </w:r>
+            <w:proofErr w:type="gramEnd"/>
+            <w:r>
+              <w:rPr>
+                <w:rFonts w:ascii="Tw Cen MT" w:hAnsi="Tw Cen MT"/>
+                <w:sz w:val="26"/>
+                <w:szCs w:val="26"/>
+              </w:rPr>
+              <w:t xml:space="preserve"> </w:t>
             </w:r>
             <w:proofErr w:type="spellStart"/>
+            <w:proofErr w:type="gramStart"/>
             <w:r>
               <w:rPr>
                 <w:rFonts w:ascii="Courier New" w:hAnsi="Courier New" w:cs="Courier New"/>
@@ -3271,6 +3445,7 @@
               </w:rPr>
               <w:t xml:space="preserve"> )</w:t>
             </w:r>
+            <w:proofErr w:type="gramEnd"/>
           </w:p>
         </w:tc>
       </w:tr>
@@ -3310,6 +3485,7 @@
               </w:rPr>
             </w:pPr>
             <w:proofErr w:type="spellStart"/>
+            <w:proofErr w:type="gramStart"/>
             <w:r>
               <w:rPr>
                 <w:rFonts w:ascii="Courier New" w:hAnsi="Courier New" w:cs="Courier New"/>
@@ -3325,7 +3501,16 @@
                 <w:sz w:val="20"/>
                 <w:szCs w:val="20"/>
               </w:rPr>
-              <w:t>()</w:t>
+              <w:t>(</w:t>
+            </w:r>
+            <w:proofErr w:type="gramEnd"/>
+            <w:r>
+              <w:rPr>
+                <w:rFonts w:ascii="Courier New" w:hAnsi="Courier New" w:cs="Courier New"/>
+                <w:sz w:val="20"/>
+                <w:szCs w:val="20"/>
+              </w:rPr>
+              <w:t>)</w:t>
             </w:r>
           </w:p>
         </w:tc>
@@ -3342,6 +3527,7 @@
               </w:rPr>
             </w:pPr>
             <w:proofErr w:type="spellStart"/>
+            <w:proofErr w:type="gramStart"/>
             <w:r>
               <w:rPr>
                 <w:rFonts w:ascii="Courier New" w:hAnsi="Courier New" w:cs="Courier New"/>
@@ -3357,7 +3543,16 @@
                 <w:sz w:val="20"/>
                 <w:szCs w:val="20"/>
               </w:rPr>
-              <w:t>()</w:t>
+              <w:t>(</w:t>
+            </w:r>
+            <w:proofErr w:type="gramEnd"/>
+            <w:r>
+              <w:rPr>
+                <w:rFonts w:ascii="Courier New" w:hAnsi="Courier New" w:cs="Courier New"/>
+                <w:sz w:val="20"/>
+                <w:szCs w:val="20"/>
+              </w:rPr>
+              <w:t>)</w:t>
             </w:r>
           </w:p>
         </w:tc>
@@ -3398,6 +3593,7 @@
               </w:rPr>
             </w:pPr>
             <w:proofErr w:type="spellStart"/>
+            <w:proofErr w:type="gramStart"/>
             <w:r>
               <w:rPr>
                 <w:rFonts w:ascii="Courier New" w:hAnsi="Courier New" w:cs="Courier New"/>
@@ -3413,7 +3609,16 @@
                 <w:sz w:val="20"/>
                 <w:szCs w:val="20"/>
               </w:rPr>
-              <w:t>()</w:t>
+              <w:t>(</w:t>
+            </w:r>
+            <w:proofErr w:type="gramEnd"/>
+            <w:r>
+              <w:rPr>
+                <w:rFonts w:ascii="Courier New" w:hAnsi="Courier New" w:cs="Courier New"/>
+                <w:sz w:val="20"/>
+                <w:szCs w:val="20"/>
+              </w:rPr>
+              <w:t>)</w:t>
             </w:r>
           </w:p>
         </w:tc>
@@ -3430,6 +3635,7 @@
               </w:rPr>
             </w:pPr>
             <w:proofErr w:type="spellStart"/>
+            <w:proofErr w:type="gramStart"/>
             <w:r>
               <w:rPr>
                 <w:rFonts w:ascii="Courier New" w:hAnsi="Courier New" w:cs="Courier New"/>
@@ -3445,7 +3651,16 @@
                 <w:sz w:val="20"/>
                 <w:szCs w:val="20"/>
               </w:rPr>
-              <w:t>()</w:t>
+              <w:t>(</w:t>
+            </w:r>
+            <w:proofErr w:type="gramEnd"/>
+            <w:r>
+              <w:rPr>
+                <w:rFonts w:ascii="Courier New" w:hAnsi="Courier New" w:cs="Courier New"/>
+                <w:sz w:val="20"/>
+                <w:szCs w:val="20"/>
+              </w:rPr>
+              <w:t>)</w:t>
             </w:r>
           </w:p>
         </w:tc>
@@ -3493,9 +3708,9 @@
                 <w:szCs w:val="20"/>
                 <w:lang w:val="en-CA"/>
               </w:rPr>
-              <w:t xml:space="preserve">while ( ! </w:t>
-            </w:r>
-            <w:proofErr w:type="spellStart"/>
+              <w:t xml:space="preserve">while </w:t>
+            </w:r>
+            <w:proofErr w:type="gramStart"/>
             <w:r>
               <w:rPr>
                 <w:rFonts w:ascii="Courier New" w:hAnsi="Courier New" w:cs="Courier New"/>
@@ -3503,9 +3718,31 @@
                 <w:szCs w:val="20"/>
                 <w:lang w:val="en-CA"/>
               </w:rPr>
+              <w:t>( !</w:t>
+            </w:r>
+            <w:proofErr w:type="gramEnd"/>
+            <w:r>
+              <w:rPr>
+                <w:rFonts w:ascii="Courier New" w:hAnsi="Courier New" w:cs="Courier New"/>
+                <w:sz w:val="20"/>
+                <w:szCs w:val="20"/>
+                <w:lang w:val="en-CA"/>
+              </w:rPr>
+              <w:t xml:space="preserve"> </w:t>
+            </w:r>
+            <w:proofErr w:type="spellStart"/>
+            <w:proofErr w:type="gramStart"/>
+            <w:r>
+              <w:rPr>
+                <w:rFonts w:ascii="Courier New" w:hAnsi="Courier New" w:cs="Courier New"/>
+                <w:sz w:val="20"/>
+                <w:szCs w:val="20"/>
+                <w:lang w:val="en-CA"/>
+              </w:rPr>
               <w:t>curseur.isAfterLast</w:t>
             </w:r>
             <w:proofErr w:type="spellEnd"/>
+            <w:proofErr w:type="gramEnd"/>
             <w:r>
               <w:rPr>
                 <w:rFonts w:ascii="Courier New" w:hAnsi="Courier New" w:cs="Courier New"/>
@@ -3554,9 +3791,9 @@
                 <w:szCs w:val="20"/>
                 <w:lang w:val="en-CA"/>
               </w:rPr>
-              <w:t xml:space="preserve">while ( </w:t>
-            </w:r>
-            <w:proofErr w:type="spellStart"/>
+              <w:t xml:space="preserve">while </w:t>
+            </w:r>
+            <w:proofErr w:type="gramStart"/>
             <w:r>
               <w:rPr>
                 <w:rFonts w:ascii="Courier New" w:hAnsi="Courier New" w:cs="Courier New"/>
@@ -3566,9 +3803,9 @@
                 <w:szCs w:val="20"/>
                 <w:lang w:val="en-CA"/>
               </w:rPr>
-              <w:t>curseur.moveToNext</w:t>
-            </w:r>
-            <w:proofErr w:type="spellEnd"/>
+              <w:t xml:space="preserve">( </w:t>
+            </w:r>
+            <w:proofErr w:type="spellStart"/>
             <w:r>
               <w:rPr>
                 <w:rFonts w:ascii="Courier New" w:hAnsi="Courier New" w:cs="Courier New"/>
@@ -3578,7 +3815,55 @@
                 <w:szCs w:val="20"/>
                 <w:lang w:val="en-CA"/>
               </w:rPr>
-              <w:t>())</w:t>
+              <w:t>curseur</w:t>
+            </w:r>
+            <w:proofErr w:type="gramEnd"/>
+            <w:r>
+              <w:rPr>
+                <w:rFonts w:ascii="Courier New" w:hAnsi="Courier New" w:cs="Courier New"/>
+                <w:b/>
+                <w:bCs/>
+                <w:sz w:val="20"/>
+                <w:szCs w:val="20"/>
+                <w:lang w:val="en-CA"/>
+              </w:rPr>
+              <w:t>.</w:t>
+            </w:r>
+            <w:proofErr w:type="gramStart"/>
+            <w:r>
+              <w:rPr>
+                <w:rFonts w:ascii="Courier New" w:hAnsi="Courier New" w:cs="Courier New"/>
+                <w:b/>
+                <w:bCs/>
+                <w:sz w:val="20"/>
+                <w:szCs w:val="20"/>
+                <w:lang w:val="en-CA"/>
+              </w:rPr>
+              <w:t>moveToNext</w:t>
+            </w:r>
+            <w:proofErr w:type="spellEnd"/>
+            <w:r>
+              <w:rPr>
+                <w:rFonts w:ascii="Courier New" w:hAnsi="Courier New" w:cs="Courier New"/>
+                <w:b/>
+                <w:bCs/>
+                <w:sz w:val="20"/>
+                <w:szCs w:val="20"/>
+                <w:lang w:val="en-CA"/>
+              </w:rPr>
+              <w:t>(</w:t>
+            </w:r>
+            <w:proofErr w:type="gramEnd"/>
+            <w:r>
+              <w:rPr>
+                <w:rFonts w:ascii="Courier New" w:hAnsi="Courier New" w:cs="Courier New"/>
+                <w:b/>
+                <w:bCs/>
+                <w:sz w:val="20"/>
+                <w:szCs w:val="20"/>
+                <w:lang w:val="en-CA"/>
+              </w:rPr>
+              <w:t>))</w:t>
             </w:r>
           </w:p>
         </w:tc>
@@ -3602,9 +3887,9 @@
                 <w:szCs w:val="20"/>
                 <w:lang w:val="en-US"/>
               </w:rPr>
-              <w:t>while ( !</w:t>
-            </w:r>
-            <w:proofErr w:type="spellStart"/>
+              <w:t xml:space="preserve">while </w:t>
+            </w:r>
+            <w:proofErr w:type="gramStart"/>
             <w:r>
               <w:rPr>
                 <w:rFonts w:ascii="Courier New" w:hAnsi="Courier New" w:cs="Courier New"/>
@@ -3612,9 +3897,9 @@
                 <w:szCs w:val="20"/>
                 <w:lang w:val="en-US"/>
               </w:rPr>
-              <w:t>rs.next</w:t>
-            </w:r>
-            <w:proofErr w:type="spellEnd"/>
+              <w:t>( !</w:t>
+            </w:r>
+            <w:proofErr w:type="spellStart"/>
             <w:r>
               <w:rPr>
                 <w:rFonts w:ascii="Courier New" w:hAnsi="Courier New" w:cs="Courier New"/>
@@ -3622,7 +3907,47 @@
                 <w:szCs w:val="20"/>
                 <w:lang w:val="en-US"/>
               </w:rPr>
-              <w:t>())</w:t>
+              <w:t>rs</w:t>
+            </w:r>
+            <w:proofErr w:type="gramEnd"/>
+            <w:r>
+              <w:rPr>
+                <w:rFonts w:ascii="Courier New" w:hAnsi="Courier New" w:cs="Courier New"/>
+                <w:sz w:val="20"/>
+                <w:szCs w:val="20"/>
+                <w:lang w:val="en-US"/>
+              </w:rPr>
+              <w:t>.</w:t>
+            </w:r>
+            <w:proofErr w:type="gramStart"/>
+            <w:r>
+              <w:rPr>
+                <w:rFonts w:ascii="Courier New" w:hAnsi="Courier New" w:cs="Courier New"/>
+                <w:sz w:val="20"/>
+                <w:szCs w:val="20"/>
+                <w:lang w:val="en-US"/>
+              </w:rPr>
+              <w:t>next</w:t>
+            </w:r>
+            <w:proofErr w:type="spellEnd"/>
+            <w:r>
+              <w:rPr>
+                <w:rFonts w:ascii="Courier New" w:hAnsi="Courier New" w:cs="Courier New"/>
+                <w:sz w:val="20"/>
+                <w:szCs w:val="20"/>
+                <w:lang w:val="en-US"/>
+              </w:rPr>
+              <w:t>(</w:t>
+            </w:r>
+            <w:proofErr w:type="gramEnd"/>
+            <w:r>
+              <w:rPr>
+                <w:rFonts w:ascii="Courier New" w:hAnsi="Courier New" w:cs="Courier New"/>
+                <w:sz w:val="20"/>
+                <w:szCs w:val="20"/>
+                <w:lang w:val="en-US"/>
+              </w:rPr>
+              <w:t>))</w:t>
             </w:r>
           </w:p>
         </w:tc>
@@ -3681,6 +4006,7 @@
               </w:rPr>
             </w:pPr>
             <w:proofErr w:type="spellStart"/>
+            <w:proofErr w:type="gramStart"/>
             <w:r>
               <w:rPr>
                 <w:rFonts w:ascii="Courier New" w:hAnsi="Courier New" w:cs="Courier New"/>
@@ -3696,15 +4022,16 @@
                 <w:sz w:val="20"/>
                 <w:szCs w:val="20"/>
               </w:rPr>
-              <w:t>(numéro du champ</w:t>
-            </w:r>
+              <w:t>(</w:t>
+            </w:r>
+            <w:proofErr w:type="gramEnd"/>
             <w:r>
               <w:rPr>
                 <w:rFonts w:ascii="Courier New" w:hAnsi="Courier New" w:cs="Courier New"/>
                 <w:sz w:val="20"/>
                 <w:szCs w:val="20"/>
               </w:rPr>
-              <w:t xml:space="preserve"> dans l’ensemble de résultats</w:t>
+              <w:t>numéro du champ</w:t>
             </w:r>
             <w:r>
               <w:rPr>
@@ -3712,8 +4039,44 @@
                 <w:sz w:val="20"/>
                 <w:szCs w:val="20"/>
               </w:rPr>
-              <w:t xml:space="preserve"> ( commence à 0 )</w:t>
-            </w:r>
+              <w:t xml:space="preserve"> dans l’ensemble de résultats</w:t>
+            </w:r>
+            <w:r>
+              <w:rPr>
+                <w:rFonts w:ascii="Courier New" w:hAnsi="Courier New" w:cs="Courier New"/>
+                <w:sz w:val="20"/>
+                <w:szCs w:val="20"/>
+              </w:rPr>
+              <w:t xml:space="preserve"> </w:t>
+            </w:r>
+            <w:proofErr w:type="gramStart"/>
+            <w:r>
+              <w:rPr>
+                <w:rFonts w:ascii="Courier New" w:hAnsi="Courier New" w:cs="Courier New"/>
+                <w:sz w:val="20"/>
+                <w:szCs w:val="20"/>
+              </w:rPr>
+              <w:t>( commence</w:t>
+            </w:r>
+            <w:proofErr w:type="gramEnd"/>
+            <w:r>
+              <w:rPr>
+                <w:rFonts w:ascii="Courier New" w:hAnsi="Courier New" w:cs="Courier New"/>
+                <w:sz w:val="20"/>
+                <w:szCs w:val="20"/>
+              </w:rPr>
+              <w:t xml:space="preserve"> à </w:t>
+            </w:r>
+            <w:proofErr w:type="gramStart"/>
+            <w:r>
+              <w:rPr>
+                <w:rFonts w:ascii="Courier New" w:hAnsi="Courier New" w:cs="Courier New"/>
+                <w:sz w:val="20"/>
+                <w:szCs w:val="20"/>
+              </w:rPr>
+              <w:t>0 )</w:t>
+            </w:r>
+            <w:proofErr w:type="gramEnd"/>
             <w:r>
               <w:rPr>
                 <w:rFonts w:ascii="Courier New" w:hAnsi="Courier New" w:cs="Courier New"/>
@@ -3737,6 +4100,7 @@
               </w:rPr>
             </w:pPr>
             <w:proofErr w:type="spellStart"/>
+            <w:proofErr w:type="gramStart"/>
             <w:r>
               <w:rPr>
                 <w:rFonts w:ascii="Courier New" w:hAnsi="Courier New" w:cs="Courier New"/>
@@ -3752,8 +4116,27 @@
                 <w:sz w:val="20"/>
                 <w:szCs w:val="20"/>
               </w:rPr>
-              <w:t>( numéro du champ )</w:t>
-            </w:r>
+              <w:t>( numéro</w:t>
+            </w:r>
+            <w:proofErr w:type="gramEnd"/>
+            <w:r>
+              <w:rPr>
+                <w:rFonts w:ascii="Courier New" w:hAnsi="Courier New" w:cs="Courier New"/>
+                <w:sz w:val="20"/>
+                <w:szCs w:val="20"/>
+              </w:rPr>
+              <w:t xml:space="preserve"> du </w:t>
+            </w:r>
+            <w:proofErr w:type="gramStart"/>
+            <w:r>
+              <w:rPr>
+                <w:rFonts w:ascii="Courier New" w:hAnsi="Courier New" w:cs="Courier New"/>
+                <w:sz w:val="20"/>
+                <w:szCs w:val="20"/>
+              </w:rPr>
+              <w:t>champ )</w:t>
+            </w:r>
+            <w:proofErr w:type="gramEnd"/>
           </w:p>
         </w:tc>
       </w:tr>
@@ -3859,12 +4242,21 @@
           <w:sz w:val="28"/>
         </w:rPr>
       </w:pPr>
+      <w:proofErr w:type="gramStart"/>
       <w:r>
         <w:rPr>
           <w:b/>
           <w:sz w:val="28"/>
         </w:rPr>
-        <w:t>exercice : Annexe 1</w:t>
+        <w:t>exercice</w:t>
+      </w:r>
+      <w:proofErr w:type="gramEnd"/>
+      <w:r>
+        <w:rPr>
+          <w:b/>
+          <w:sz w:val="28"/>
+        </w:rPr>
+        <w:t xml:space="preserve"> : Annexe 1</w:t>
       </w:r>
       <w:r>
         <w:rPr>
@@ -3932,7 +4324,7 @@
 <w:ftr xmlns:wpc="http://schemas.microsoft.com/office/word/2010/wordprocessingCanvas" xmlns:cx="http://schemas.microsoft.com/office/drawing/2014/chartex" xmlns:cx1="http://schemas.microsoft.com/office/drawing/2015/9/8/chartex" xmlns:cx2="http://schemas.microsoft.com/office/drawing/2015/10/21/chartex" xmlns:cx3="http://schemas.microsoft.com/office/drawing/2016/5/9/chartex" xmlns:cx4="http://schemas.microsoft.com/office/drawing/2016/5/10/chartex" xmlns:cx5="http://schemas.microsoft.com/office/drawing/2016/5/11/chartex" xmlns:cx6="http://schemas.microsoft.com/office/drawing/2016/5/12/chartex" xmlns:cx7="http://schemas.microsoft.com/office/drawing/2016/5/13/chartex" xmlns:cx8="http://schemas.microsoft.com/office/drawing/2016/5/14/chartex" xmlns:mc="http://schemas.openxmlformats.org/markup-compatibility/2006" xmlns:aink="http://schemas.microsoft.com/office/drawing/2016/ink" xmlns:am3d="http://schemas.microsoft.com/office/drawing/2017/model3d" xmlns:o="urn:schemas-microsoft-com:office:office" xmlns:oel="http://schemas.microsoft.com/office/2019/extlst" xmlns:r="http://schemas.openxmlformats.org/officeDocument/2006/relationships" xmlns:m="http://schemas.openxmlformats.org/officeDocument/2006/math" xmlns:v="urn:schemas-microsoft-com:vml" xmlns:wp14="http://schemas.microsoft.com/office/word/2010/wordprocessingDrawing" xmlns:wp="http://schemas.openxmlformats.org/drawingml/2006/wordprocessingDrawing" xmlns:w10="urn:schemas-microsoft-com:office:word" xmlns:w="http://schemas.openxmlformats.org/wordprocessingml/2006/main" xmlns:w14="http://schemas.microsoft.com/office/word/2010/wordml" xmlns:w15="http://schemas.microsoft.com/office/word/2012/wordml" xmlns:w16cex="http://schemas.microsoft.com/office/word/2018/wordml/cex" xmlns:w16cid="http://schemas.microsoft.com/office/word/2016/wordml/cid" xmlns:w16="http://schemas.microsoft.com/office/word/2018/wordml" xmlns:w16du="http://schemas.microsoft.com/office/word/2023/wordml/word16du" xmlns:w16sdtdh="http://schemas.microsoft.com/office/word/2020/wordml/sdtdatahash" xmlns:w16sdtfl="http://schemas.microsoft.com/office/word/2024/wordml/sdtformatlock" xmlns:w16se="http://schemas.microsoft.com/office/word/2015/wordml/symex" xmlns:wpg="http://schemas.microsoft.com/office/word/2010/wordprocessingGroup" xmlns:wpi="http://schemas.microsoft.com/office/word/2010/wordprocessingInk" xmlns:wne="http://schemas.microsoft.com/office/word/2006/wordml" xmlns:wps="http://schemas.microsoft.com/office/word/2010/wordprocessingShape" mc:Ignorable="w14 w15 w16se w16cid w16 w16cex w16sdtdh w16sdtfl w16du wp14">
   <w:p>
     <w:pPr>
-      <w:pStyle w:val="Pieddepage"/>
+      <w:pStyle w:val="Footer"/>
       <w:shd w:val="clear" w:color="auto" w:fill="D9D9D9" w:themeFill="background1" w:themeFillShade="D9"/>
       <w:jc w:val="center"/>
       <w:rPr>
@@ -3993,7 +4385,7 @@
 <w:hdr xmlns:wpc="http://schemas.microsoft.com/office/word/2010/wordprocessingCanvas" xmlns:cx="http://schemas.microsoft.com/office/drawing/2014/chartex" xmlns:cx1="http://schemas.microsoft.com/office/drawing/2015/9/8/chartex" xmlns:cx2="http://schemas.microsoft.com/office/drawing/2015/10/21/chartex" xmlns:cx3="http://schemas.microsoft.com/office/drawing/2016/5/9/chartex" xmlns:cx4="http://schemas.microsoft.com/office/drawing/2016/5/10/chartex" xmlns:cx5="http://schemas.microsoft.com/office/drawing/2016/5/11/chartex" xmlns:cx6="http://schemas.microsoft.com/office/drawing/2016/5/12/chartex" xmlns:cx7="http://schemas.microsoft.com/office/drawing/2016/5/13/chartex" xmlns:cx8="http://schemas.microsoft.com/office/drawing/2016/5/14/chartex" xmlns:mc="http://schemas.openxmlformats.org/markup-compatibility/2006" xmlns:aink="http://schemas.microsoft.com/office/drawing/2016/ink" xmlns:am3d="http://schemas.microsoft.com/office/drawing/2017/model3d" xmlns:o="urn:schemas-microsoft-com:office:office" xmlns:oel="http://schemas.microsoft.com/office/2019/extlst" xmlns:r="http://schemas.openxmlformats.org/officeDocument/2006/relationships" xmlns:m="http://schemas.openxmlformats.org/officeDocument/2006/math" xmlns:v="urn:schemas-microsoft-com:vml" xmlns:wp14="http://schemas.microsoft.com/office/word/2010/wordprocessingDrawing" xmlns:wp="http://schemas.openxmlformats.org/drawingml/2006/wordprocessingDrawing" xmlns:w10="urn:schemas-microsoft-com:office:word" xmlns:w="http://schemas.openxmlformats.org/wordprocessingml/2006/main" xmlns:w14="http://schemas.microsoft.com/office/word/2010/wordml" xmlns:w15="http://schemas.microsoft.com/office/word/2012/wordml" xmlns:w16cex="http://schemas.microsoft.com/office/word/2018/wordml/cex" xmlns:w16cid="http://schemas.microsoft.com/office/word/2016/wordml/cid" xmlns:w16="http://schemas.microsoft.com/office/word/2018/wordml" xmlns:w16du="http://schemas.microsoft.com/office/word/2023/wordml/word16du" xmlns:w16sdtdh="http://schemas.microsoft.com/office/word/2020/wordml/sdtdatahash" xmlns:w16sdtfl="http://schemas.microsoft.com/office/word/2024/wordml/sdtformatlock" xmlns:w16se="http://schemas.microsoft.com/office/word/2015/wordml/symex" xmlns:wpg="http://schemas.microsoft.com/office/word/2010/wordprocessingGroup" xmlns:wpi="http://schemas.microsoft.com/office/word/2010/wordprocessingInk" xmlns:wne="http://schemas.microsoft.com/office/word/2006/wordml" xmlns:wps="http://schemas.microsoft.com/office/word/2010/wordprocessingShape" mc:Ignorable="w14 w15 w16se w16cid w16 w16cex w16sdtdh w16sdtfl w16du wp14">
   <w:p>
     <w:pPr>
-      <w:pStyle w:val="En-tte"/>
+      <w:pStyle w:val="Header"/>
       <w:jc w:val="left"/>
     </w:pPr>
     <w:sdt>
@@ -4008,7 +4400,6 @@
           <w:docPartUnique/>
         </w:docPartObj>
       </w:sdtPr>
-      <w:sdtEndPr/>
       <w:sdtContent>
         <w:r>
           <w:rPr>
@@ -4025,7 +4416,7 @@
                   <w:p>
                     <w:pPr>
                       <w:rPr>
-                        <w:rStyle w:val="Numrodepage"/>
+                        <w:rStyle w:val="PageNumber"/>
                         <w:color w:val="FFFFFF" w:themeColor="background1"/>
                         <w:szCs w:val="24"/>
                       </w:rPr>
@@ -4041,7 +4432,7 @@
                     </w:r>
                     <w:r>
                       <w:rPr>
-                        <w:rStyle w:val="Numrodepage"/>
+                        <w:rStyle w:val="PageNumber"/>
                         <w:b/>
                         <w:bCs/>
                         <w:noProof/>
@@ -4054,7 +4445,7 @@
                     </w:r>
                     <w:r>
                       <w:rPr>
-                        <w:rStyle w:val="Numrodepage"/>
+                        <w:rStyle w:val="PageNumber"/>
                         <w:b/>
                         <w:bCs/>
                         <w:color w:val="FFFFFF" w:themeColor="background1"/>
@@ -7175,11 +7566,11 @@
     <w:qFormat/>
     <w:rsid w:val="00294AF4"/>
   </w:style>
-  <w:style w:type="paragraph" w:styleId="Titre1">
+  <w:style w:type="paragraph" w:styleId="Heading1">
     <w:name w:val="heading 1"/>
     <w:basedOn w:val="Normal"/>
     <w:next w:val="Normal"/>
-    <w:link w:val="Titre1Car"/>
+    <w:link w:val="Heading1Char"/>
     <w:qFormat/>
     <w:rsid w:val="003B6362"/>
     <w:pPr>
@@ -7199,13 +7590,13 @@
       <w:lang w:eastAsia="fr-FR"/>
     </w:rPr>
   </w:style>
-  <w:style w:type="character" w:default="1" w:styleId="Policepardfaut">
+  <w:style w:type="character" w:default="1" w:styleId="DefaultParagraphFont">
     <w:name w:val="Default Paragraph Font"/>
     <w:uiPriority w:val="1"/>
     <w:semiHidden/>
     <w:unhideWhenUsed/>
   </w:style>
-  <w:style w:type="table" w:default="1" w:styleId="TableauNormal">
+  <w:style w:type="table" w:default="1" w:styleId="TableNormal">
     <w:name w:val="Normal Table"/>
     <w:uiPriority w:val="99"/>
     <w:semiHidden/>
@@ -7220,16 +7611,16 @@
       </w:tblCellMar>
     </w:tblPr>
   </w:style>
-  <w:style w:type="numbering" w:default="1" w:styleId="Aucuneliste">
+  <w:style w:type="numbering" w:default="1" w:styleId="NoList">
     <w:name w:val="No List"/>
     <w:uiPriority w:val="99"/>
     <w:semiHidden/>
     <w:unhideWhenUsed/>
   </w:style>
-  <w:style w:type="paragraph" w:styleId="En-tte">
+  <w:style w:type="paragraph" w:styleId="Header">
     <w:name w:val="header"/>
     <w:basedOn w:val="Normal"/>
-    <w:link w:val="En-tteCar"/>
+    <w:link w:val="HeaderChar"/>
     <w:uiPriority w:val="99"/>
     <w:unhideWhenUsed/>
     <w:rsid w:val="00801C69"/>
@@ -7240,17 +7631,17 @@
       </w:tabs>
     </w:pPr>
   </w:style>
-  <w:style w:type="character" w:customStyle="1" w:styleId="En-tteCar">
-    <w:name w:val="En-tête Car"/>
-    <w:basedOn w:val="Policepardfaut"/>
-    <w:link w:val="En-tte"/>
+  <w:style w:type="character" w:customStyle="1" w:styleId="HeaderChar">
+    <w:name w:val="Header Char"/>
+    <w:basedOn w:val="DefaultParagraphFont"/>
+    <w:link w:val="Header"/>
     <w:uiPriority w:val="99"/>
     <w:rsid w:val="00801C69"/>
   </w:style>
-  <w:style w:type="paragraph" w:styleId="Pieddepage">
+  <w:style w:type="paragraph" w:styleId="Footer">
     <w:name w:val="footer"/>
     <w:basedOn w:val="Normal"/>
-    <w:link w:val="PieddepageCar"/>
+    <w:link w:val="FooterChar"/>
     <w:uiPriority w:val="99"/>
     <w:unhideWhenUsed/>
     <w:rsid w:val="00801C69"/>
@@ -7261,17 +7652,17 @@
       </w:tabs>
     </w:pPr>
   </w:style>
-  <w:style w:type="character" w:customStyle="1" w:styleId="PieddepageCar">
-    <w:name w:val="Pied de page Car"/>
-    <w:basedOn w:val="Policepardfaut"/>
-    <w:link w:val="Pieddepage"/>
+  <w:style w:type="character" w:customStyle="1" w:styleId="FooterChar">
+    <w:name w:val="Footer Char"/>
+    <w:basedOn w:val="DefaultParagraphFont"/>
+    <w:link w:val="Footer"/>
     <w:uiPriority w:val="99"/>
     <w:rsid w:val="00801C69"/>
   </w:style>
-  <w:style w:type="paragraph" w:styleId="Textedebulles">
+  <w:style w:type="paragraph" w:styleId="BalloonText">
     <w:name w:val="Balloon Text"/>
     <w:basedOn w:val="Normal"/>
-    <w:link w:val="TextedebullesCar"/>
+    <w:link w:val="BalloonTextChar"/>
     <w:uiPriority w:val="99"/>
     <w:semiHidden/>
     <w:unhideWhenUsed/>
@@ -7282,10 +7673,10 @@
       <w:szCs w:val="16"/>
     </w:rPr>
   </w:style>
-  <w:style w:type="character" w:customStyle="1" w:styleId="TextedebullesCar">
-    <w:name w:val="Texte de bulles Car"/>
-    <w:basedOn w:val="Policepardfaut"/>
-    <w:link w:val="Textedebulles"/>
+  <w:style w:type="character" w:customStyle="1" w:styleId="BalloonTextChar">
+    <w:name w:val="Balloon Text Char"/>
+    <w:basedOn w:val="DefaultParagraphFont"/>
+    <w:link w:val="BalloonText"/>
     <w:uiPriority w:val="99"/>
     <w:semiHidden/>
     <w:rsid w:val="00801C69"/>
@@ -7295,9 +7686,9 @@
       <w:szCs w:val="16"/>
     </w:rPr>
   </w:style>
-  <w:style w:type="character" w:styleId="lev">
+  <w:style w:type="character" w:styleId="Strong">
     <w:name w:val="Strong"/>
-    <w:basedOn w:val="Policepardfaut"/>
+    <w:basedOn w:val="DefaultParagraphFont"/>
     <w:uiPriority w:val="8"/>
     <w:qFormat/>
     <w:rsid w:val="00167EEF"/>
@@ -7306,7 +7697,7 @@
       <w:bCs/>
     </w:rPr>
   </w:style>
-  <w:style w:type="paragraph" w:styleId="Paragraphedeliste">
+  <w:style w:type="paragraph" w:styleId="ListParagraph">
     <w:name w:val="List Paragraph"/>
     <w:basedOn w:val="Normal"/>
     <w:uiPriority w:val="34"/>
@@ -7326,9 +7717,9 @@
       <w:lang w:val="fr-FR"/>
     </w:rPr>
   </w:style>
-  <w:style w:type="table" w:styleId="Grilledutableau">
+  <w:style w:type="table" w:styleId="TableGrid">
     <w:name w:val="Table Grid"/>
-    <w:basedOn w:val="TableauNormal"/>
+    <w:basedOn w:val="TableNormal"/>
     <w:uiPriority w:val="59"/>
     <w:rsid w:val="00BF5CA2"/>
     <w:pPr>
@@ -7349,9 +7740,9 @@
       </w:tblBorders>
     </w:tblPr>
   </w:style>
-  <w:style w:type="character" w:styleId="Lienhypertexte">
+  <w:style w:type="character" w:styleId="Hyperlink">
     <w:name w:val="Hyperlink"/>
-    <w:basedOn w:val="Policepardfaut"/>
+    <w:basedOn w:val="DefaultParagraphFont"/>
     <w:uiPriority w:val="99"/>
     <w:unhideWhenUsed/>
     <w:rsid w:val="00612C59"/>
@@ -7360,10 +7751,10 @@
       <w:u w:val="single"/>
     </w:rPr>
   </w:style>
-  <w:style w:type="character" w:customStyle="1" w:styleId="Titre1Car">
-    <w:name w:val="Titre 1 Car"/>
-    <w:basedOn w:val="Policepardfaut"/>
-    <w:link w:val="Titre1"/>
+  <w:style w:type="character" w:customStyle="1" w:styleId="Heading1Char">
+    <w:name w:val="Heading 1 Char"/>
+    <w:basedOn w:val="DefaultParagraphFont"/>
+    <w:link w:val="Heading1"/>
     <w:rsid w:val="003B6362"/>
     <w:rPr>
       <w:rFonts w:ascii="Cambria" w:eastAsia="Times New Roman" w:hAnsi="Cambria" w:cs="Arial"/>
@@ -7377,8 +7768,8 @@
   </w:style>
   <w:style w:type="table" w:customStyle="1" w:styleId="Grilledutableau1">
     <w:name w:val="Grille du tableau1"/>
-    <w:basedOn w:val="TableauNormal"/>
-    <w:next w:val="Grilledutableau"/>
+    <w:basedOn w:val="TableNormal"/>
+    <w:next w:val="TableGrid"/>
     <w:uiPriority w:val="59"/>
     <w:rsid w:val="00D85BE8"/>
     <w:pPr>
@@ -7395,16 +7786,16 @@
       </w:tblBorders>
     </w:tblPr>
   </w:style>
-  <w:style w:type="character" w:styleId="Numrodepage">
+  <w:style w:type="character" w:styleId="PageNumber">
     <w:name w:val="page number"/>
-    <w:basedOn w:val="Policepardfaut"/>
+    <w:basedOn w:val="DefaultParagraphFont"/>
     <w:uiPriority w:val="99"/>
     <w:unhideWhenUsed/>
     <w:rsid w:val="00C44AC0"/>
   </w:style>
-  <w:style w:type="character" w:styleId="Marquedecommentaire">
+  <w:style w:type="character" w:styleId="CommentReference">
     <w:name w:val="annotation reference"/>
-    <w:basedOn w:val="Policepardfaut"/>
+    <w:basedOn w:val="DefaultParagraphFont"/>
     <w:uiPriority w:val="99"/>
     <w:semiHidden/>
     <w:unhideWhenUsed/>
@@ -7414,10 +7805,10 @@
       <w:szCs w:val="16"/>
     </w:rPr>
   </w:style>
-  <w:style w:type="paragraph" w:styleId="Commentaire">
+  <w:style w:type="paragraph" w:styleId="CommentText">
     <w:name w:val="annotation text"/>
     <w:basedOn w:val="Normal"/>
-    <w:link w:val="CommentaireCar"/>
+    <w:link w:val="CommentTextChar"/>
     <w:uiPriority w:val="99"/>
     <w:semiHidden/>
     <w:unhideWhenUsed/>
@@ -7427,10 +7818,10 @@
       <w:szCs w:val="20"/>
     </w:rPr>
   </w:style>
-  <w:style w:type="character" w:customStyle="1" w:styleId="CommentaireCar">
-    <w:name w:val="Commentaire Car"/>
-    <w:basedOn w:val="Policepardfaut"/>
-    <w:link w:val="Commentaire"/>
+  <w:style w:type="character" w:customStyle="1" w:styleId="CommentTextChar">
+    <w:name w:val="Comment Text Char"/>
+    <w:basedOn w:val="DefaultParagraphFont"/>
+    <w:link w:val="CommentText"/>
     <w:uiPriority w:val="99"/>
     <w:semiHidden/>
     <w:rsid w:val="00DE277B"/>
@@ -7439,11 +7830,11 @@
       <w:szCs w:val="20"/>
     </w:rPr>
   </w:style>
-  <w:style w:type="paragraph" w:styleId="Objetducommentaire">
+  <w:style w:type="paragraph" w:styleId="CommentSubject">
     <w:name w:val="annotation subject"/>
-    <w:basedOn w:val="Commentaire"/>
-    <w:next w:val="Commentaire"/>
-    <w:link w:val="ObjetducommentaireCar"/>
+    <w:basedOn w:val="CommentText"/>
+    <w:next w:val="CommentText"/>
+    <w:link w:val="CommentSubjectChar"/>
     <w:uiPriority w:val="99"/>
     <w:semiHidden/>
     <w:unhideWhenUsed/>
@@ -7453,10 +7844,10 @@
       <w:bCs/>
     </w:rPr>
   </w:style>
-  <w:style w:type="character" w:customStyle="1" w:styleId="ObjetducommentaireCar">
-    <w:name w:val="Objet du commentaire Car"/>
-    <w:basedOn w:val="CommentaireCar"/>
-    <w:link w:val="Objetducommentaire"/>
+  <w:style w:type="character" w:customStyle="1" w:styleId="CommentSubjectChar">
+    <w:name w:val="Comment Subject Char"/>
+    <w:basedOn w:val="CommentTextChar"/>
+    <w:link w:val="CommentSubject"/>
     <w:uiPriority w:val="99"/>
     <w:semiHidden/>
     <w:rsid w:val="00DE277B"/>
@@ -7467,9 +7858,9 @@
       <w:szCs w:val="20"/>
     </w:rPr>
   </w:style>
-  <w:style w:type="character" w:styleId="Textedelespacerserv">
+  <w:style w:type="character" w:styleId="PlaceholderText">
     <w:name w:val="Placeholder Text"/>
-    <w:basedOn w:val="Policepardfaut"/>
+    <w:basedOn w:val="DefaultParagraphFont"/>
     <w:uiPriority w:val="99"/>
     <w:semiHidden/>
     <w:rsid w:val="00500CDA"/>
@@ -7502,7 +7893,7 @@
         <w:p>
           <w:r>
             <w:rPr>
-              <w:rStyle w:val="Textedelespacerserv"/>
+              <w:rStyle w:val="PlaceholderText"/>
             </w:rPr>
             <w:t>Cliquez ou appuyez ici pour entrer du texte.</w:t>
           </w:r>
@@ -7534,7 +7925,7 @@
     <w:charset w:val="00"/>
     <w:family w:val="swiss"/>
     <w:pitch w:val="variable"/>
-    <w:sig w:usb0="E4002EFF" w:usb1="C200247B" w:usb2="00000009" w:usb3="00000000" w:csb0="000001FF" w:csb1="00000000"/>
+    <w:sig w:usb0="E4002EFF" w:usb1="C000247B" w:usb2="00000009" w:usb3="00000000" w:csb0="000001FF" w:csb1="00000000"/>
   </w:font>
   <w:font w:name="Courier New">
     <w:panose1 w:val="02070309020205020404"/>
@@ -7586,17 +7977,16 @@
     <w:sig w:usb0="E10002FF" w:usb1="5000ECFF" w:usb2="00000021" w:usb3="00000000" w:csb0="0000019F" w:csb1="00000000"/>
   </w:font>
   <w:font w:name="Aptos">
-    <w:altName w:val="Calibri"/>
     <w:charset w:val="00"/>
-    <w:family w:val="roman"/>
-    <w:pitch w:val="default"/>
+    <w:family w:val="swiss"/>
+    <w:pitch w:val="variable"/>
+    <w:sig w:usb0="20000287" w:usb1="00000003" w:usb2="00000000" w:usb3="00000000" w:csb0="0000019F" w:csb1="00000000"/>
   </w:font>
   <w:font w:name="Aptos Display">
-    <w:panose1 w:val="00000000000000000000"/>
     <w:charset w:val="00"/>
-    <w:family w:val="roman"/>
-    <w:notTrueType/>
-    <w:pitch w:val="default"/>
+    <w:family w:val="swiss"/>
+    <w:pitch w:val="variable"/>
+    <w:sig w:usb0="20000287" w:usb1="00000003" w:usb2="00000000" w:usb3="00000000" w:csb0="0000019F" w:csb1="00000000"/>
   </w:font>
 </w:fonts>
 </file>
@@ -7619,9 +8009,11 @@
   <w:rsids>
     <w:rsidRoot w:val="008D4ECC"/>
     <w:rsid w:val="00147BF4"/>
+    <w:rsid w:val="003106ED"/>
     <w:rsid w:val="008D4ECC"/>
     <w:rsid w:val="00B44A00"/>
     <w:rsid w:val="00B87C54"/>
+    <w:rsid w:val="00D616E4"/>
     <w:rsid w:val="00F75EC2"/>
     <w:rsid w:val="00F76BD0"/>
   </w:rsids>
@@ -8045,13 +8437,13 @@
     <w:name w:val="Normal"/>
     <w:qFormat/>
   </w:style>
-  <w:style w:type="character" w:default="1" w:styleId="Policepardfaut">
+  <w:style w:type="character" w:default="1" w:styleId="DefaultParagraphFont">
     <w:name w:val="Default Paragraph Font"/>
     <w:uiPriority w:val="1"/>
     <w:semiHidden/>
     <w:unhideWhenUsed/>
   </w:style>
-  <w:style w:type="table" w:default="1" w:styleId="TableauNormal">
+  <w:style w:type="table" w:default="1" w:styleId="TableNormal">
     <w:name w:val="Normal Table"/>
     <w:uiPriority w:val="99"/>
     <w:semiHidden/>
@@ -8066,15 +8458,15 @@
       </w:tblCellMar>
     </w:tblPr>
   </w:style>
-  <w:style w:type="numbering" w:default="1" w:styleId="Aucuneliste">
+  <w:style w:type="numbering" w:default="1" w:styleId="NoList">
     <w:name w:val="No List"/>
     <w:uiPriority w:val="99"/>
     <w:semiHidden/>
     <w:unhideWhenUsed/>
   </w:style>
-  <w:style w:type="character" w:styleId="Textedelespacerserv">
+  <w:style w:type="character" w:styleId="PlaceholderText">
     <w:name w:val="Placeholder Text"/>
-    <w:basedOn w:val="Policepardfaut"/>
+    <w:basedOn w:val="DefaultParagraphFont"/>
     <w:uiPriority w:val="99"/>
     <w:semiHidden/>
     <w:rsid w:val="008D4ECC"/>

</xml_diff>